<commit_message>
SonarQube analysis and report updated
</commit_message>
<xml_diff>
--- a/SonarQube Static Analysis Report.docx
+++ b/SonarQube Static Analysis Report.docx
@@ -39,7 +39,21 @@
           <w:sz w:val="32"/>
           <w:szCs w:val="32"/>
         </w:rPr>
-        <w:t> 18.02.2026</w:t>
+        <w:t> 18.0</w:t>
+      </w:r>
+      <w:r>
+        <w:rPr>
+          <w:sz w:val="32"/>
+          <w:szCs w:val="32"/>
+        </w:rPr>
+        <w:t>3</w:t>
+      </w:r>
+      <w:r>
+        <w:rPr>
+          <w:sz w:val="32"/>
+          <w:szCs w:val="32"/>
+        </w:rPr>
+        <w:t>.2026</w:t>
       </w:r>
       <w:r>
         <w:rPr>
@@ -319,7 +333,7 @@
           </w:tcPr>
           <w:p>
             <w:r>
-              <w:t>1</w:t>
+              <w:t>0</w:t>
             </w:r>
           </w:p>
         </w:tc>
@@ -425,7 +439,7 @@
           </w:tcPr>
           <w:p>
             <w:r>
-              <w:t>130</w:t>
+              <w:t>91</w:t>
             </w:r>
           </w:p>
         </w:tc>
@@ -487,7 +501,7 @@
               <w:rPr>
                 <w:rFonts w:ascii="Arial" w:hAnsi="Arial" w:cs="Arial"/>
               </w:rPr>
-              <w:t>131</w:t>
+              <w:t>91</w:t>
             </w:r>
           </w:p>
         </w:tc>
@@ -540,7 +554,7 @@
           </w:tcPr>
           <w:p>
             <w:r>
-              <w:t>72.2%</w:t>
+              <w:t>80.0%</w:t>
             </w:r>
           </w:p>
         </w:tc>
@@ -593,7 +607,10 @@
           </w:tcPr>
           <w:p>
             <w:r>
-              <w:t>1.4%</w:t>
+              <w:t>0.9</w:t>
+            </w:r>
+            <w:r>
+              <w:t>%</w:t>
             </w:r>
           </w:p>
         </w:tc>
@@ -864,7 +881,7 @@
           </w:tcPr>
           <w:p>
             <w:r>
-              <w:t>0</w:t>
+              <w:t>1</w:t>
             </w:r>
           </w:p>
         </w:tc>
@@ -917,7 +934,7 @@
           </w:tcPr>
           <w:p>
             <w:r>
-              <w:t>6</w:t>
+              <w:t>9</w:t>
             </w:r>
           </w:p>
         </w:tc>
@@ -970,7 +987,7 @@
           </w:tcPr>
           <w:p>
             <w:r>
-              <w:t>113</w:t>
+              <w:t>47</w:t>
             </w:r>
           </w:p>
         </w:tc>
@@ -1023,7 +1040,7 @@
           </w:tcPr>
           <w:p>
             <w:r>
-              <w:t>12</w:t>
+              <w:t>32</w:t>
             </w:r>
           </w:p>
         </w:tc>
@@ -1074,7 +1091,7 @@
           </w:tcPr>
           <w:p>
             <w:r>
-              <w:t>0</w:t>
+              <w:t>2</w:t>
             </w:r>
           </w:p>
         </w:tc>
@@ -1133,7 +1150,7 @@
           <w:sz w:val="28"/>
           <w:szCs w:val="28"/>
         </w:rPr>
-        <w:t>Define a constant instead of duplicating this literal "LON-ES001" 3 times.</w:t>
+        <w:t>Add at least one assertion to this test case.</w:t>
       </w:r>
     </w:p>
     <w:p>
@@ -1219,7 +1236,6 @@
           <w:sz w:val="32"/>
           <w:szCs w:val="32"/>
         </w:rPr>
-        <w:lastRenderedPageBreak/>
         <w:t>Screenshots</w:t>
       </w:r>
     </w:p>
@@ -1232,13 +1248,16 @@
       </w:pPr>
       <w:r>
         <w:rPr>
+          <w:b/>
+          <w:bCs/>
           <w:noProof/>
         </w:rPr>
+        <w:lastRenderedPageBreak/>
         <w:drawing>
-          <wp:inline distT="0" distB="0" distL="0" distR="0" wp14:anchorId="618B41F6" wp14:editId="263606D1">
-            <wp:extent cx="5943600" cy="2727960"/>
+          <wp:inline distT="0" distB="0" distL="0" distR="0" wp14:anchorId="054201EB" wp14:editId="2D2B9A8A">
+            <wp:extent cx="6219825" cy="3509510"/>
             <wp:effectExtent l="0" t="0" r="0" b="0"/>
-            <wp:docPr id="386974658" name="Picture 1"/>
+            <wp:docPr id="262885986" name="Picture 4"/>
             <wp:cNvGraphicFramePr>
               <a:graphicFrameLocks xmlns:a="http://schemas.openxmlformats.org/drawingml/2006/main" noChangeAspect="1"/>
             </wp:cNvGraphicFramePr>
@@ -1246,13 +1265,13 @@
               <a:graphicData uri="http://schemas.openxmlformats.org/drawingml/2006/picture">
                 <pic:pic xmlns:pic="http://schemas.openxmlformats.org/drawingml/2006/picture">
                   <pic:nvPicPr>
-                    <pic:cNvPr id="0" name="Picture 9"/>
+                    <pic:cNvPr id="0" name="Picture 2"/>
                     <pic:cNvPicPr>
                       <a:picLocks noChangeAspect="1" noChangeArrowheads="1"/>
                     </pic:cNvPicPr>
                   </pic:nvPicPr>
                   <pic:blipFill>
-                    <a:blip r:embed="rId5" cstate="print">
+                    <a:blip r:embed="rId5">
                       <a:extLst>
                         <a:ext uri="{28A0092B-C50C-407E-A947-70E740481C1C}">
                           <a14:useLocalDpi xmlns:a14="http://schemas.microsoft.com/office/drawing/2010/main" val="0"/>
@@ -1267,15 +1286,12 @@
                   <pic:spPr bwMode="auto">
                     <a:xfrm>
                       <a:off x="0" y="0"/>
-                      <a:ext cx="5943600" cy="2727960"/>
+                      <a:ext cx="6237157" cy="3519289"/>
                     </a:xfrm>
                     <a:prstGeom prst="rect">
                       <a:avLst/>
                     </a:prstGeom>
                     <a:noFill/>
-                    <a:ln>
-                      <a:noFill/>
-                    </a:ln>
                   </pic:spPr>
                 </pic:pic>
               </a:graphicData>
@@ -1291,15 +1307,24 @@
           <w:bCs/>
         </w:rPr>
       </w:pPr>
-      <w:r>
-        <w:rPr>
-          <w:noProof/>
+    </w:p>
+    <w:p>
+      <w:pPr>
+        <w:rPr>
+          <w:b/>
+          <w:bCs/>
+        </w:rPr>
+      </w:pPr>
+      <w:r>
+        <w:rPr>
+          <w:b/>
+          <w:bCs/>
         </w:rPr>
         <w:drawing>
-          <wp:inline distT="0" distB="0" distL="0" distR="0" wp14:anchorId="723BF7C6" wp14:editId="1BE473AA">
-            <wp:extent cx="5943600" cy="2738755"/>
-            <wp:effectExtent l="0" t="0" r="0" b="4445"/>
-            <wp:docPr id="1372869928" name="Picture 3"/>
+          <wp:inline distT="0" distB="0" distL="0" distR="0" wp14:anchorId="2DD2E60F" wp14:editId="100AE0D6">
+            <wp:extent cx="5943600" cy="2505075"/>
+            <wp:effectExtent l="0" t="0" r="0" b="9525"/>
+            <wp:docPr id="1954956992" name="Picture 1"/>
             <wp:cNvGraphicFramePr>
               <a:graphicFrameLocks xmlns:a="http://schemas.openxmlformats.org/drawingml/2006/main" noChangeAspect="1"/>
             </wp:cNvGraphicFramePr>
@@ -1307,36 +1332,23 @@
               <a:graphicData uri="http://schemas.openxmlformats.org/drawingml/2006/picture">
                 <pic:pic xmlns:pic="http://schemas.openxmlformats.org/drawingml/2006/picture">
                   <pic:nvPicPr>
-                    <pic:cNvPr id="0" name="Picture 13"/>
-                    <pic:cNvPicPr>
-                      <a:picLocks noChangeAspect="1" noChangeArrowheads="1"/>
-                    </pic:cNvPicPr>
+                    <pic:cNvPr id="1954956992" name=""/>
+                    <pic:cNvPicPr/>
                   </pic:nvPicPr>
                   <pic:blipFill>
-                    <a:blip r:embed="rId6" cstate="print">
-                      <a:extLst>
-                        <a:ext uri="{28A0092B-C50C-407E-A947-70E740481C1C}">
-                          <a14:useLocalDpi xmlns:a14="http://schemas.microsoft.com/office/drawing/2010/main" val="0"/>
-                        </a:ext>
-                      </a:extLst>
-                    </a:blip>
-                    <a:srcRect/>
+                    <a:blip r:embed="rId6"/>
                     <a:stretch>
                       <a:fillRect/>
                     </a:stretch>
                   </pic:blipFill>
-                  <pic:spPr bwMode="auto">
+                  <pic:spPr>
                     <a:xfrm>
                       <a:off x="0" y="0"/>
-                      <a:ext cx="5943600" cy="2738755"/>
+                      <a:ext cx="5943600" cy="2505075"/>
                     </a:xfrm>
                     <a:prstGeom prst="rect">
                       <a:avLst/>
                     </a:prstGeom>
-                    <a:noFill/>
-                    <a:ln>
-                      <a:noFill/>
-                    </a:ln>
                   </pic:spPr>
                 </pic:pic>
               </a:graphicData>
@@ -1350,6 +1362,14 @@
         <w:rPr>
           <w:b/>
           <w:bCs/>
+        </w:rPr>
+      </w:pPr>
+    </w:p>
+    <w:p>
+      <w:pPr>
+        <w:rPr>
+          <w:b/>
+          <w:bCs/>
           <w:sz w:val="32"/>
           <w:szCs w:val="32"/>
         </w:rPr>
@@ -1399,53 +1419,73 @@
           <w:sz w:val="28"/>
           <w:szCs w:val="28"/>
         </w:rPr>
-        <w:t xml:space="preserve"> 131 </w:t>
+        <w:t xml:space="preserve"> </w:t>
       </w:r>
       <w:r>
         <w:rPr>
           <w:sz w:val="28"/>
           <w:szCs w:val="28"/>
         </w:rPr>
-        <w:t xml:space="preserve">issues. </w:t>
-      </w:r>
-      <w:proofErr w:type="gramStart"/>
+        <w:t>91</w:t>
+      </w:r>
       <w:r>
         <w:rPr>
           <w:sz w:val="28"/>
           <w:szCs w:val="28"/>
         </w:rPr>
-        <w:t>The majority of</w:t>
-      </w:r>
-      <w:proofErr w:type="gramEnd"/>
+        <w:t xml:space="preserve"> </w:t>
+      </w:r>
       <w:r>
         <w:rPr>
           <w:sz w:val="28"/>
           <w:szCs w:val="28"/>
         </w:rPr>
-        <w:t xml:space="preserve"> issues are </w:t>
-      </w:r>
-      <w:r>
-        <w:rPr>
-          <w:b/>
-          <w:bCs/>
+        <w:t>issues.</w:t>
+      </w:r>
+      <w:r>
+        <w:rPr>
           <w:sz w:val="28"/>
           <w:szCs w:val="28"/>
         </w:rPr>
-        <w:t>Maintainability</w:t>
+        <w:t xml:space="preserve"> All</w:t>
       </w:r>
       <w:r>
         <w:rPr>
           <w:sz w:val="28"/>
           <w:szCs w:val="28"/>
         </w:rPr>
-        <w:t xml:space="preserve">. </w:t>
-      </w:r>
-      <w:r>
-        <w:rPr>
+        <w:t xml:space="preserve"> of issues are </w:t>
+      </w:r>
+      <w:r>
+        <w:rPr>
+          <w:b/>
+          <w:bCs/>
           <w:sz w:val="28"/>
           <w:szCs w:val="28"/>
         </w:rPr>
-        <w:t>The analysis confirms that the codebase implements the required functionality but would benefit from refactoring in areas of </w:t>
+        <w:t>Maintainability</w:t>
+      </w:r>
+      <w:r>
+        <w:rPr>
+          <w:sz w:val="28"/>
+          <w:szCs w:val="28"/>
+        </w:rPr>
+        <w:t xml:space="preserve">. </w:t>
+      </w:r>
+      <w:r>
+        <w:rPr>
+          <w:sz w:val="28"/>
+          <w:szCs w:val="28"/>
+        </w:rPr>
+        <w:t xml:space="preserve">The analysis confirms that the </w:t>
+      </w:r>
+      <w:r>
+        <w:rPr>
+          <w:sz w:val="28"/>
+          <w:szCs w:val="28"/>
+        </w:rPr>
+        <w:lastRenderedPageBreak/>
+        <w:t>codebase implements the required functionality but would benefit from refactoring in areas of </w:t>
       </w:r>
       <w:r>
         <w:rPr>

</xml_diff>